<commit_message>
Base LaHaus bloques: triple ICONTEC
Co-Authored-By: Claude Opus 5.5 <noreply@anthropic.com>
</commit_message>
<xml_diff>
--- a/recursos/comercial/plataforma LaHaus/BASE_LAHAUS_BLOQUES_5000.docx
+++ b/recursos/comercial/plataforma LaHaus/BASE_LAHAUS_BLOQUES_5000.docx
@@ -9,7 +9,7 @@
           <w:color w:val="E54C09"/>
           <w:sz w:val="28"/>
         </w:rPr>
-        <w:t>BASE DEL ASISTENTE v2026-10-08 — BLOQUES DE MÁXIMO 4.800 CARACTERES PARA LAS CARGAS MANUALES DE LAHAUS</w:t>
+        <w:t>BASE DEL ASISTENTE v2026-10-10 — BLOQUES DE MÁXIMO 4.800 CARACTERES PARA LAS CARGAS MANUALES DE LAHAUS</w:t>
       </w:r>
     </w:p>
     <w:p>
@@ -34,7 +34,7 @@
           <w:color w:val="E54C09"/>
           <w:sz w:val="24"/>
         </w:rPr>
-        <w:t>BLOQUE 1 DE 5  ·  4,634 caracteres  ·  pegar en la carga manual #1 (reemplaza todo)</w:t>
+        <w:t>BLOQUE 1 DE 5  ·  4,765 caracteres  ·  pegar en la carga manual #1 (reemplaza todo)</w:t>
       </w:r>
     </w:p>
     <w:p>
@@ -277,7 +277,7 @@
         <w:rPr>
           <w:sz w:val="20"/>
         </w:rPr>
-        <w:t>Academia de inglés PRESENCIAL en Bucaramanga. Institución de educación para el trabajo y desarrollo humano con licencia desde 2012, programas registrados ante la Secretaría de Educación (Resoluciones 1581-1131 y 2253-2025) y certificación de calidad ICONTEC (NTC 5555 e ISO 9001). Método propio: clases inmersivas, activas y prácticas; se habla inglés desde la primera clase (se menciona una vez por conversación, cuando preguntan cómo son las clases; nunca "de pie", nunca nombres de metodologías, nunca "fácil", "rápido" ni "fluidez desde el primer día"). Lo ÚNICO que se afirma como "la única academia de la ciudad": la GARANTÍA DE APRENDIZAJE POR ESCRITO en el contrato. ICONTEC es una certificación y Cajasan es un convenio, no exclusividades. Una sola fecha de trayectoria: 2012.</w:t>
+        <w:t>Academia de inglés PRESENCIAL en Bucaramanga. Institución de educación para el trabajo y desarrollo humano con licencia desde 2012, programas registrados ante la Secretaría de Educación (Resoluciones 1581-1131 y 2253-2025) y triple certificación de calidad ICONTEC (NTC 5555, NTC 5580 e ISO 9001). Método propio: clases inmersivas, activas y prácticas; se habla inglés desde la primera clase (se menciona una vez por conversación, cuando preguntan cómo son las clases; nunca "de pie", nunca nombres de metodologías, nunca "fácil", "rápido" ni "fluidez desde el primer día"). Lo ÚNICO que se afirma como "la única academia PRESENCIAL de Bucaramanga": la GARANTÍA DE APRENDIZAJE POR ESCRITO en el contrato, sin letra pequeña (siempre con la palabra "presencial": las plataformas online sí tienen garantías). ICONTEC es una certificación y Cajasan es un convenio, no exclusividades. Una sola fecha de trayectoria: 2012.</w:t>
       </w:r>
     </w:p>
     <w:p>

</xml_diff>